<commit_message>
docs(decisions): index records and clarify design ownership
</commit_message>
<xml_diff>
--- a/docs/ARCHITECTURE DECISION RECORDS CAA 181026.docx
+++ b/docs/ARCHITECTURE DECISION RECORDS CAA 181026.docx
@@ -19,6 +19,16 @@
           <w:sz w:val="32"/>
         </w:rPr>
         <w:t>Architecture Decision Records</w:t>
+      </w:r>
+    </w:p>
+    <w:p>
+      <w:r>
+        <w:t>See the [ConnectSphere decision register](../decisions/README.md) for the</w:t>
+      </w:r>
+    </w:p>
+    <w:p>
+      <w:r>
+        <w:t>single entry point to BDR, ADR and repository decision records.</w:t>
       </w:r>
     </w:p>
     <w:p>

</xml_diff>

<commit_message>
docs(decisions): reconcile IDs and release scope plan
</commit_message>
<xml_diff>
--- a/docs/ARCHITECTURE DECISION RECORDS CAA 181026.docx
+++ b/docs/ARCHITECTURE DECISION RECORDS CAA 181026.docx
@@ -93,7 +93,7 @@
     </w:p>
     <w:p>
       <w:r>
-        <w:t>O-50/O-51 explicit.</w:t>
+        <w:t>T-98/T-99 close O-50/O-51.</w:t>
       </w:r>
     </w:p>
     <w:p>
@@ -5512,7 +5512,7 @@
         <w:rPr>
           <w:sz w:val="22"/>
         </w:rPr>
-        <w:t>**Related BDR:** C-62, C-107, T-48, T-79, T-85, O-10, O-50, O-51</w:t>
+        <w:t>**Related BDR:** C-62, C-107, T-48, T-79, T-85, T-98, T-99, O-10, O-50, O-51</w:t>
       </w:r>
     </w:p>
     <w:p>
@@ -5630,17 +5630,27 @@
     </w:p>
     <w:p>
       <w:r>
-        <w:t>and combined Event capacity are enforced as recorded in T-85. The per-Session</w:t>
-      </w:r>
-    </w:p>
-    <w:p>
-      <w:r>
-        <w:t>waitlist behavior remains the explicit assumption O-50; copied transactional</w:t>
-      </w:r>
-    </w:p>
-    <w:p>
-      <w:r>
-        <w:t>data remains the explicit assumption O-51.</w:t>
+        <w:t>and combined Event capacity are enforced as recorded in T-85. T-98 closes O-50:</w:t>
+      </w:r>
+    </w:p>
+    <w:p>
+      <w:r>
+        <w:t>the Event-level waitlist remains available for combined Event capacity, with no</w:t>
+      </w:r>
+    </w:p>
+    <w:p>
+      <w:r>
+        <w:t>per-Session waitlist. T-99 closes O-51: copying an Event copies its requirements</w:t>
+      </w:r>
+    </w:p>
+    <w:p>
+      <w:r>
+        <w:t>and Session structure, clears dates/times, and omits bookings, equipment</w:t>
+      </w:r>
+    </w:p>
+    <w:p>
+      <w:r>
+        <w:t>reservations and registrations.</w:t>
       </w:r>
     </w:p>
     <w:p>

</xml_diff>